<commit_message>
fix: update report template line spacing to 28pt
</commit_message>
<xml_diff>
--- a/word_templates/template.docx
+++ b/word_templates/template.docx
@@ -141,7 +141,7 @@
     <w:p>
       <w:pPr>
         <w:shd w:val="clear" w:color="auto" w:fill="FFFFFF"/>
-        <w:spacing w:line="520" w:lineRule="exact"/>
+        <w:spacing w:line="560" w:lineRule="exact"/>
         <w:ind w:left="-253" w:right="-253"/>
         <w:rPr>
           <w:rFonts w:hint="eastAsia" w:ascii="黑体" w:hAnsi="黑体" w:eastAsia="黑体" w:cs="黑体"/>
@@ -164,7 +164,7 @@
       <w:pPr>
         <w:shd w:val="clear" w:color="auto" w:fill="FFFFFF"/>
         <w:wordWrap w:val="0"/>
-        <w:spacing w:line="520" w:lineRule="exact"/>
+        <w:spacing w:line="560" w:lineRule="exact"/>
         <w:ind w:left="-43" w:right="-43"/>
         <w:rPr>
           <w:rFonts w:eastAsia="仿宋_GB2312"/>
@@ -196,7 +196,7 @@
       <w:pPr>
         <w:shd w:val="clear" w:color="auto" w:fill="FFFFFF"/>
         <w:wordWrap w:val="0"/>
-        <w:spacing w:line="520" w:lineRule="exact"/>
+        <w:spacing w:line="560" w:lineRule="exact"/>
         <w:ind w:left="-43" w:right="-43"/>
         <w:rPr>
           <w:rFonts w:eastAsia="仿宋_GB2312"/>
@@ -228,7 +228,7 @@
       <w:pPr>
         <w:shd w:val="clear" w:color="auto" w:fill="FFFFFF"/>
         <w:wordWrap w:val="0"/>
-        <w:spacing w:line="520" w:lineRule="exact"/>
+        <w:spacing w:line="560" w:lineRule="exact"/>
         <w:ind w:left="-43" w:right="-43"/>
         <w:rPr>
           <w:rFonts w:eastAsia="仿宋_GB2312"/>
@@ -308,7 +308,7 @@
       <w:pPr>
         <w:shd w:val="clear" w:color="auto" w:fill="FFFFFF"/>
         <w:wordWrap w:val="0"/>
-        <w:spacing w:line="520" w:lineRule="exact"/>
+        <w:spacing w:line="560" w:lineRule="exact"/>
         <w:ind w:left="-43" w:right="-43"/>
         <w:rPr>
           <w:rFonts w:eastAsia="仿宋_GB2312"/>
@@ -399,7 +399,7 @@
           <w:tab w:val="left" w:pos="8236"/>
         </w:tabs>
         <w:wordWrap w:val="0"/>
-        <w:spacing w:line="520" w:lineRule="exact"/>
+        <w:spacing w:line="560" w:lineRule="exact"/>
         <w:ind w:left="-43" w:right="-43"/>
         <w:rPr>
           <w:rFonts w:eastAsia="仿宋_GB2312"/>
@@ -444,7 +444,7 @@
         </w:numPr>
         <w:shd w:val="clear" w:color="auto" w:fill="FFFFFF"/>
         <w:wordWrap w:val="0"/>
-        <w:spacing w:line="520" w:lineRule="exact"/>
+        <w:spacing w:line="560" w:lineRule="exact"/>
         <w:ind w:left="-43" w:right="-43" w:firstLine="320" w:firstLineChars="100"/>
         <w:rPr>
           <w:rFonts w:hint="eastAsia" w:eastAsia="仿宋_GB2312"/>
@@ -561,7 +561,7 @@
         </w:numPr>
         <w:shd w:val="clear" w:color="auto" w:fill="FFFFFF"/>
         <w:wordWrap w:val="0"/>
-        <w:spacing w:line="520" w:lineRule="exact"/>
+        <w:spacing w:line="560" w:lineRule="exact"/>
         <w:ind w:left="-43" w:right="-43" w:firstLine="320" w:firstLineChars="100"/>
         <w:rPr>
           <w:rFonts w:eastAsia="仿宋_GB2312"/>
@@ -657,7 +657,7 @@
       <w:pPr>
         <w:shd w:val="clear" w:color="auto" w:fill="FFFFFF"/>
         <w:wordWrap w:val="0"/>
-        <w:spacing w:line="520" w:lineRule="exact"/>
+        <w:spacing w:line="560" w:lineRule="exact"/>
         <w:ind w:left="-43" w:right="-43"/>
         <w:rPr>
           <w:rFonts w:eastAsia="仿宋_GB2312"/>
@@ -689,7 +689,7 @@
       <w:pPr>
         <w:shd w:val="clear" w:color="auto" w:fill="FFFFFF"/>
         <w:wordWrap w:val="0"/>
-        <w:spacing w:line="520" w:lineRule="exact"/>
+        <w:spacing w:line="560" w:lineRule="exact"/>
         <w:ind w:left="-43" w:right="-43"/>
         <w:rPr>
           <w:rFonts w:eastAsia="仿宋_GB2312"/>
@@ -893,7 +893,7 @@
           <w:tab w:val="left" w:pos="8967"/>
         </w:tabs>
         <w:wordWrap w:val="0"/>
-        <w:spacing w:line="520" w:lineRule="exact"/>
+        <w:spacing w:line="560" w:lineRule="exact"/>
         <w:ind w:left="-43" w:right="-43"/>
         <w:rPr>
           <w:rFonts w:eastAsia="仿宋_GB2312"/>
@@ -925,7 +925,7 @@
       <w:pPr>
         <w:shd w:val="clear" w:color="auto" w:fill="FFFFFF"/>
         <w:wordWrap w:val="0"/>
-        <w:spacing w:line="520" w:lineRule="exact"/>
+        <w:spacing w:line="560" w:lineRule="exact"/>
         <w:ind w:left="-43" w:right="-43"/>
         <w:rPr>
           <w:rFonts w:eastAsia="仿宋_GB2312"/>
@@ -981,7 +981,7 @@
       <w:pPr>
         <w:shd w:val="clear" w:color="auto" w:fill="FFFFFF"/>
         <w:wordWrap w:val="0"/>
-        <w:spacing w:line="520" w:lineRule="exact"/>
+        <w:spacing w:line="560" w:lineRule="exact"/>
         <w:ind w:left="-43" w:right="-43"/>
         <w:rPr>
           <w:rFonts w:eastAsia="仿宋_GB2312"/>
@@ -1061,7 +1061,7 @@
       <w:pPr>
         <w:shd w:val="clear" w:color="auto" w:fill="FFFFFF"/>
         <w:wordWrap w:val="0"/>
-        <w:spacing w:line="520" w:lineRule="exact"/>
+        <w:spacing w:line="560" w:lineRule="exact"/>
         <w:ind w:left="-43" w:right="-43"/>
         <w:rPr>
           <w:rFonts w:eastAsia="仿宋_GB2312"/>
@@ -1109,7 +1109,7 @@
     <w:p>
       <w:pPr>
         <w:shd w:val="clear" w:color="auto" w:fill="FFFFFF"/>
-        <w:spacing w:line="520" w:lineRule="exact"/>
+        <w:spacing w:line="560" w:lineRule="exact"/>
         <w:ind w:left="-253" w:right="-253"/>
         <w:rPr>
           <w:rFonts w:ascii="黑体" w:hAnsi="黑体" w:eastAsia="黑体" w:cs="黑体"/>
@@ -1132,7 +1132,7 @@
       <w:pPr>
         <w:shd w:val="clear" w:color="auto" w:fill="FFFFFF"/>
         <w:wordWrap w:val="0"/>
-        <w:spacing w:line="520" w:lineRule="exact"/>
+        <w:spacing w:line="560" w:lineRule="exact"/>
         <w:ind w:left="-43" w:right="-43"/>
         <w:rPr>
           <w:rFonts w:ascii="楷体_GB2312" w:hAnsi="楷体_GB2312" w:eastAsia="楷体_GB2312" w:cs="楷体_GB2312"/>
@@ -1155,7 +1155,7 @@
       <w:pPr>
         <w:shd w:val="clear" w:color="auto" w:fill="FFFFFF"/>
         <w:wordWrap w:val="0"/>
-        <w:spacing w:line="520" w:lineRule="exact"/>
+        <w:spacing w:line="560" w:lineRule="exact"/>
         <w:ind w:left="-253" w:right="-253" w:firstLine="640" w:firstLineChars="200"/>
         <w:rPr>
           <w:rFonts w:eastAsia="仿宋_GB2312"/>
@@ -1202,7 +1202,7 @@
       <w:pPr>
         <w:shd w:val="clear" w:color="auto" w:fill="FFFFFF"/>
         <w:wordWrap w:val="0"/>
-        <w:spacing w:line="520" w:lineRule="exact"/>
+        <w:spacing w:line="560" w:lineRule="exact"/>
         <w:ind w:left="-43" w:right="-43"/>
         <w:rPr>
           <w:rFonts w:ascii="楷体_GB2312" w:hAnsi="楷体_GB2312" w:eastAsia="楷体_GB2312" w:cs="楷体_GB2312"/>
@@ -1225,7 +1225,7 @@
       <w:pPr>
         <w:shd w:val="clear" w:color="auto" w:fill="FFFFFF"/>
         <w:wordWrap w:val="0"/>
-        <w:spacing w:line="520" w:lineRule="exact"/>
+        <w:spacing w:line="560" w:lineRule="exact"/>
         <w:ind w:left="-43" w:right="-43" w:firstLine="320" w:firstLineChars="100"/>
         <w:rPr>
           <w:rFonts w:eastAsia="仿宋_GB2312"/>
@@ -1291,7 +1291,7 @@
       <w:pPr>
         <w:shd w:val="clear" w:color="auto" w:fill="FFFFFF"/>
         <w:wordWrap w:val="0"/>
-        <w:spacing w:line="520" w:lineRule="exact"/>
+        <w:spacing w:line="560" w:lineRule="exact"/>
         <w:ind w:left="-43" w:right="-43" w:firstLine="320" w:firstLineChars="100"/>
         <w:rPr>
           <w:rFonts w:eastAsia="仿宋_GB2312"/>
@@ -1439,7 +1439,7 @@
           <w:tab w:val="left" w:pos="3876"/>
         </w:tabs>
         <w:wordWrap w:val="0"/>
-        <w:spacing w:line="520" w:lineRule="exact"/>
+        <w:spacing w:line="560" w:lineRule="exact"/>
         <w:ind w:left="-43" w:right="-43"/>
         <w:rPr>
           <w:rFonts w:eastAsia="仿宋_GB2312"/>
@@ -1480,7 +1480,7 @@
       <w:pPr>
         <w:shd w:val="clear" w:color="auto" w:fill="FFFFFF"/>
         <w:wordWrap w:val="0"/>
-        <w:spacing w:line="520" w:lineRule="exact"/>
+        <w:spacing w:line="560" w:lineRule="exact"/>
         <w:ind w:left="-43" w:right="-43" w:firstLine="320" w:firstLineChars="100"/>
         <w:rPr>
           <w:rFonts w:eastAsia="仿宋_GB2312"/>
@@ -1617,7 +1617,7 @@
       <w:pPr>
         <w:shd w:val="clear" w:color="auto" w:fill="FFFFFF"/>
         <w:wordWrap w:val="0"/>
-        <w:spacing w:line="520" w:lineRule="exact"/>
+        <w:spacing w:line="560" w:lineRule="exact"/>
         <w:ind w:left="-43" w:right="-43" w:firstLine="320" w:firstLineChars="100"/>
         <w:rPr>
           <w:rFonts w:eastAsia="仿宋_GB2312"/>
@@ -1674,7 +1674,7 @@
       <w:pPr>
         <w:shd w:val="clear" w:color="auto" w:fill="FFFFFF"/>
         <w:wordWrap w:val="0"/>
-        <w:spacing w:line="520" w:lineRule="exact"/>
+        <w:spacing w:line="560" w:lineRule="exact"/>
         <w:ind w:left="-43" w:right="-43" w:firstLine="320" w:firstLineChars="100"/>
         <w:rPr>
           <w:rFonts w:eastAsia="仿宋_GB2312"/>
@@ -1755,7 +1755,7 @@
       <w:pPr>
         <w:shd w:val="clear" w:color="auto" w:fill="FFFFFF"/>
         <w:wordWrap w:val="0"/>
-        <w:spacing w:line="520" w:lineRule="exact"/>
+        <w:spacing w:line="560" w:lineRule="exact"/>
         <w:ind w:left="-43" w:right="-43" w:firstLine="320" w:firstLineChars="100"/>
         <w:rPr>
           <w:rFonts w:eastAsia="仿宋_GB2312"/>
@@ -1895,7 +1895,7 @@
           <w:tab w:val="left" w:pos="7035"/>
         </w:tabs>
         <w:wordWrap w:val="0"/>
-        <w:spacing w:line="520" w:lineRule="exact"/>
+        <w:spacing w:line="560" w:lineRule="exact"/>
         <w:ind w:left="-43" w:right="-43"/>
         <w:rPr>
           <w:rFonts w:eastAsia="仿宋_GB2312"/>
@@ -1927,7 +1927,7 @@
       <w:pPr>
         <w:shd w:val="clear" w:color="auto" w:fill="FFFFFF"/>
         <w:wordWrap w:val="0"/>
-        <w:spacing w:line="520" w:lineRule="exact"/>
+        <w:spacing w:line="560" w:lineRule="exact"/>
         <w:ind w:left="-43" w:right="-43" w:firstLine="640" w:firstLineChars="200"/>
         <w:rPr>
           <w:rFonts w:hint="eastAsia" w:eastAsia="仿宋_GB2312"/>

</xml_diff>